<commit_message>
Fjernet utsteder da det styres av regnskapssystemet.
</commit_message>
<xml_diff>
--- a/docs/hjelp_fakturagrunnlag.docx
+++ b/docs/hjelp_fakturagrunnlag.docx
@@ -802,33 +802,33 @@
           <w:ilvl w:val="0"/>
           <w:numId w:val="2"/>
         </w:numPr>
-        <w:rPr>
-          <w:b/>
-          <w:bCs/>
-        </w:rPr>
-      </w:pPr>
-      <w:r>
-        <w:rPr>
-          <w:b/>
-          <w:bCs/>
-        </w:rPr>
-        <w:t xml:space="preserve">Utsteder. </w:t>
-      </w:r>
-      <w:r>
-        <w:t xml:space="preserve"> Fakturautsteder må angis med </w:t>
-      </w:r>
-      <w:r>
-        <w:t>parameterne</w:t>
-      </w:r>
-      <w:r>
-        <w:t>:</w:t>
-      </w:r>
-      <w:r>
-        <w:br/>
-        <w:t>utsteder, adr1, adr2, adr3</w:t>
-      </w:r>
-      <w:r>
-        <w:t>, epost, tlf.</w:t>
+      </w:pPr>
+      <w:proofErr w:type="spellStart"/>
+      <w:r>
+        <w:rPr>
+          <w:b/>
+          <w:bCs/>
+        </w:rPr>
+        <w:t>ordrenummer_start</w:t>
+      </w:r>
+      <w:proofErr w:type="spellEnd"/>
+      <w:r>
+        <w:rPr>
+          <w:b/>
+          <w:bCs/>
+        </w:rPr>
+        <w:t xml:space="preserve">. </w:t>
+      </w:r>
+      <w:r>
+        <w:t xml:space="preserve"> Regnskapssystemet bruker en ordrenummerserie når fakturaer lages manuelt. Ved import av ordrer må det brukes en serie som ikke kolliderer med serier som er i bruk. Ved neste gangs ordreimport (neste løp f. eks), må </w:t>
+      </w:r>
+      <w:proofErr w:type="spellStart"/>
+      <w:r>
+        <w:t>ordrenummer_start</w:t>
+      </w:r>
+      <w:proofErr w:type="spellEnd"/>
+      <w:r>
+        <w:t xml:space="preserve"> oppdateres med det siste ordrenummer + 1.</w:t>
       </w:r>
     </w:p>
     <w:p>
@@ -838,66 +838,6 @@
           <w:ilvl w:val="0"/>
           <w:numId w:val="2"/>
         </w:numPr>
-        <w:rPr>
-          <w:b/>
-          <w:bCs/>
-        </w:rPr>
-      </w:pPr>
-      <w:r>
-        <w:rPr>
-          <w:b/>
-          <w:bCs/>
-        </w:rPr>
-        <w:t>Ordre</w:t>
-      </w:r>
-      <w:r>
-        <w:rPr>
-          <w:b/>
-          <w:bCs/>
-        </w:rPr>
-        <w:t>nummer</w:t>
-      </w:r>
-      <w:r>
-        <w:rPr>
-          <w:b/>
-          <w:bCs/>
-        </w:rPr>
-        <w:t>-/</w:t>
-      </w:r>
-      <w:r>
-        <w:rPr>
-          <w:b/>
-          <w:bCs/>
-        </w:rPr>
-        <w:t xml:space="preserve">kundenummer start. </w:t>
-      </w:r>
-      <w:r>
-        <w:t xml:space="preserve"> Må angis</w:t>
-      </w:r>
-      <w:r>
-        <w:t xml:space="preserve"> slik at de ikke kolliderer med </w:t>
-      </w:r>
-      <w:r>
-        <w:t xml:space="preserve">eksisterende </w:t>
-      </w:r>
-      <w:r>
-        <w:t>ordre- og kundenummer i regnskapssystemet.</w:t>
-      </w:r>
-      <w:r>
-        <w:t xml:space="preserve"> Ved senere eksport/import, må man justere disse numrene slik:</w:t>
-      </w:r>
-    </w:p>
-    <w:p>
-      <w:pPr>
-        <w:pStyle w:val="ListParagraph"/>
-        <w:numPr>
-          <w:ilvl w:val="1"/>
-          <w:numId w:val="2"/>
-        </w:numPr>
-        <w:rPr>
-          <w:b/>
-          <w:bCs/>
-        </w:rPr>
       </w:pPr>
       <w:proofErr w:type="spellStart"/>
       <w:r>
@@ -905,7 +845,7 @@
           <w:b/>
           <w:bCs/>
         </w:rPr>
-        <w:t>ordrenummer_start</w:t>
+        <w:t>kundenummer_start</w:t>
       </w:r>
       <w:proofErr w:type="spellEnd"/>
       <w:r>
@@ -916,23 +856,41 @@
         <w:t xml:space="preserve">. </w:t>
       </w:r>
       <w:r>
-        <w:t>Fortsette i halen av forrige eksport/import.</w:t>
-      </w:r>
-    </w:p>
-    <w:p>
-      <w:pPr>
-        <w:pStyle w:val="ListParagraph"/>
-        <w:numPr>
-          <w:ilvl w:val="1"/>
-          <w:numId w:val="2"/>
-        </w:numPr>
-        <w:rPr>
-          <w:b/>
-          <w:bCs/>
-        </w:rPr>
-      </w:pPr>
+        <w:t xml:space="preserve">Ved import av ordrene lages det egne kunder i regnskapssystemet </w:t>
+      </w:r>
+      <w:r>
+        <w:t>for de kundene som er med i importfilen. For kunder som finnes fra før blir informasjonen oppdatert. Kundenummer i den skapte importfilen baserer seg på nedlastet E</w:t>
+      </w:r>
       <w:proofErr w:type="spellStart"/>
       <w:r>
+        <w:t>ventor</w:t>
+      </w:r>
+      <w:proofErr w:type="spellEnd"/>
+      <w:r>
+        <w:t xml:space="preserve"> klubbregister. </w:t>
+      </w:r>
+      <w:r>
+        <w:br/>
+      </w:r>
+      <w:r>
+        <w:rPr>
+          <w:b/>
+          <w:bCs/>
+        </w:rPr>
+        <w:t>Kundenummer</w:t>
+      </w:r>
+      <w:r>
+        <w:rPr>
+          <w:b/>
+          <w:bCs/>
+        </w:rPr>
+        <w:t xml:space="preserve"> =</w:t>
+      </w:r>
+      <w:r>
+        <w:t xml:space="preserve"> </w:t>
+      </w:r>
+      <w:proofErr w:type="spellStart"/>
+      <w:r>
         <w:rPr>
           <w:b/>
           <w:bCs/>
@@ -945,40 +903,17 @@
           <w:b/>
           <w:bCs/>
         </w:rPr>
-        <w:t xml:space="preserve">. </w:t>
-      </w:r>
-      <w:r>
-        <w:t>Kundenummer = (</w:t>
-      </w:r>
-      <w:proofErr w:type="spellStart"/>
-      <w:r>
-        <w:t>kundenummer_start</w:t>
-      </w:r>
-      <w:proofErr w:type="spellEnd"/>
-      <w:r>
-        <w:t xml:space="preserve"> + klubbnummer i </w:t>
-      </w:r>
-      <w:proofErr w:type="spellStart"/>
-      <w:r>
-        <w:t>Eventor</w:t>
-      </w:r>
-      <w:proofErr w:type="spellEnd"/>
-      <w:r>
-        <w:t>). Denne bør ha samme verdi som sist. Da vil klubben peke på samme kunde som sist</w:t>
-      </w:r>
-      <w:r>
-        <w:t xml:space="preserve"> (siden klubbnummer i </w:t>
-      </w:r>
-      <w:proofErr w:type="spellStart"/>
-      <w:r>
-        <w:t>Eventor</w:t>
-      </w:r>
-      <w:proofErr w:type="spellEnd"/>
-      <w:r>
-        <w:t xml:space="preserve"> er stabilt)</w:t>
-      </w:r>
-      <w:r>
-        <w:t>, og oppdatere med eventuell ny kontakt-info.</w:t>
+        <w:t xml:space="preserve"> + klubbnummer.</w:t>
+      </w:r>
+      <w:r>
+        <w:rPr>
+          <w:b/>
+          <w:bCs/>
+        </w:rPr>
+        <w:br/>
+      </w:r>
+      <w:r>
+        <w:t>Dette bestemmes første gang, slik at det ikke kolliderer med allerede brukte serier i regnskapssystemet, og senere ikke endres ved nye importer.</w:t>
       </w:r>
     </w:p>
     <w:p/>

</xml_diff>